<commit_message>
docs: refine final order wording
Co-authored-by: arena-agent <297053741+arena-agent@users.noreply.github.com>
</commit_message>
<xml_diff>
--- a/154/Готовый_приказ_финальная_редакция.docx
+++ b/154/Готовый_приказ_финальная_редакция.docx
@@ -177,7 +177,7 @@
           <w:i w:val="0"/>
           <w:sz w:val="28"/>
         </w:rPr>
-        <w:t xml:space="preserve"> Отделу криминалистики следственного управления организовать криминалистическое сопровождение предварительного расследования, оказание практической и методической помощи следственным органам, применение криминалистической и специальной техники, подготовку справок и заключений криминалистического характера по следующим направлениям деятельности следственного управления:</w:t>
+        <w:t xml:space="preserve"> Отделу криминалистики следственного управления организовать криминалистическое сопровождение предварительного расследования, оказание практической и методической помощи следственным органам, применение криминалистической и специальной техники, подготовку справок, заключений и предложений по вопросам, относящимся к компетенции отдела криминалистики, по следующим направлениям деятельности следственного управления:</w:t>
       </w:r>
     </w:p>
     <w:p>
@@ -653,7 +653,7 @@
           <w:i w:val="0"/>
           <w:sz w:val="28"/>
         </w:rPr>
-        <w:t xml:space="preserve"> Обеспечить незамедлительное направление в отдел криминалистики следственного управления после возникновения оснований для возбуждения ходатайства о продлении процессуальных сроков в связи с длительным производством экспертных исследований уголовных дел либо копий материалов в объеме, необходимом для изучения, для подготовки справки криминалистического характера о своевременности, полноте и качестве назначения судебных экспертиз, взаимодействии с экспертными учреждениями и причинах длительности их производства.</w:t>
+        <w:t xml:space="preserve"> Обеспечить незамедлительное направление в отдел криминалистики следственного управления после возникновения оснований для возбуждения ходатайства о продлении процессуальных сроков в связи с длительным производством экспертных исследований уголовных дел либо копий материалов в объеме, необходимом для изучения, для подготовки справки отдела криминалистики по вопросам своевременности, полноты и качества назначения судебных экспертиз, взаимодействия с экспертными учреждениями и причин длительности их производства.</w:t>
       </w:r>
     </w:p>
     <w:p>
@@ -1395,7 +1395,23 @@
           <w:i w:val="0"/>
           <w:sz w:val="28"/>
         </w:rPr>
-        <w:t xml:space="preserve"> Уголовные дела, находящиеся в производстве следственных отделов по расследованию особо важных дел следственного управления, не направлять в контрольно-следственный отдел следственного управления для согласования ходатайств о продлении процессуальных сроков, проектов постановлений о прекращении уголовного дела (уголовного преследования), проектов постановлений о приостановлении предварительного следствия, решений о переквалификации преступления с более тяжкого на менее тяжкое, а также решений об изменении либо отмене подозреваемому (обвиняемому) меры пресечения в виде заключения под стражу, если иное не поручено руководителем следственного управления или его заместителем.</w:t>
+        <w:t xml:space="preserve"> Рассмотрение вопросов о продлении процессуальных сроков, прекращении уголовного дела (уголовного преследования), приостановлении предварительного следствия, переквалификации преступления с более тяжкого на менее тяжкое, а также изменении либо отмене подозреваемому (обвиняемому) меры пресечения в виде заключения под стражу по уголовным делам, находящимся в производстве следственных отделов по расследованию особо важных дел следственного управления, осуществляется руководителями указанных отделов самостоятельно в пределах полномочий, предусмотренных УПК РФ и организационно-распорядительными документами Следственного комитета Российской Федерации.</w:t>
+      </w:r>
+    </w:p>
+    <w:p>
+      <w:pPr>
+        <w:spacing w:after="0" w:line="276" w:lineRule="auto"/>
+        <w:ind w:firstLine="709"/>
+        <w:jc w:val="both"/>
+      </w:pPr>
+      <w:r>
+        <w:rPr>
+          <w:rFonts w:ascii="Times New Roman" w:hAnsi="Times New Roman" w:eastAsia="Times New Roman"/>
+          <w:b w:val="0"/>
+          <w:i w:val="0"/>
+          <w:sz w:val="28"/>
+        </w:rPr>
+        <w:t>Направление указанных уголовных дел и материалов в контрольно-следственный отдел следственного управления для изучения и подготовки заключения осуществляется по поручению руководителя следственного управления или его заместителя.</w:t>
       </w:r>
     </w:p>
     <w:p>
@@ -2121,7 +2137,7 @@
           <w:i w:val="0"/>
           <w:sz w:val="28"/>
         </w:rPr>
-        <w:t>При разрешении жалоб, обращений и заявлений граждан по уголовным делам, по которым отделом криминалистики осуществляется криминалистическое сопровождение, при необходимости истребовать из отдела криминалистики следственного управления справки по вопросам криминалистического характера, копии подготовленных им справок и заключений, а также иную информацию, необходимую для подготовки мотивированного ответа.</w:t>
+        <w:t>При разрешении жалоб, обращений и заявлений граждан по уголовным делам, по которым отделом криминалистики осуществляется криминалистическое сопровождение, при необходимости истребовать из отдела криминалистики следственного управления справки по вопросам, относящимся к компетенции отдела криминалистики, копии подготовленных им справок и заключений, а также иную информацию, необходимую для подготовки мотивированного ответа.</w:t>
       </w:r>
     </w:p>
     <w:p>
@@ -2244,7 +2260,7 @@
           <w:i w:val="0"/>
           <w:sz w:val="28"/>
         </w:rPr>
-        <w:t>По уголовным делам о тяжких и особо тяжких преступлениях, совершенных в условиях неочевидности, по которым лицо, совершившее преступление, не установлено, участвовать в производстве следственных и процессуальных действий, своевременно подготавливать предложения и проекты письменных указаний криминалистического характера по поручению руководителя следственного управления (курирующего заместителя руководителя следственного управления), участвовать в оперативных и межведомственных совещаниях.</w:t>
+        <w:t>По уголовным делам о тяжких и особо тяжких преступлениях, совершенных в условиях неочевидности, по которым лицо, совершившее преступление, не установлено, участвовать в производстве следственных и процессуальных действий, своевременно подготавливать предложения и проекты письменных указаний по вопросам, относящимся к компетенции отдела криминалистики, по поручению руководителя следственного управления (курирующего заместителя руководителя следственного управления), участвовать в оперативных и межведомственных совещаниях.</w:t>
       </w:r>
     </w:p>
     <w:p>
@@ -2269,7 +2285,7 @@
           <w:i w:val="0"/>
           <w:sz w:val="28"/>
         </w:rPr>
-        <w:t xml:space="preserve"> Обеспечить оказание следователями-криминалистами практической и методической помощи следственным отделам при назначении наиболее сложных, комплексных, комиссионных, повторных, дорогостоящих судебных экспертиз, а также экспертиз по уголовным делам, указанным в пункте 2 настоящего приказа, по запросам руководителей следственных отделов, следователей, контрольно-следственного отдела, следственных отделов по расследованию особо важных дел либо по поручению руководителя следственного управления или курирующего заместителя руководителя следственного управления.</w:t>
+        <w:t xml:space="preserve"> Обеспечить оказание следователями-криминалистами практической и методической помощи следственным отделам при назначении наиболее сложных, комплексных, комиссионных, повторных судебных экспертиз, а также платных судебных экспертиз, в том числе по уголовным делам, указанным в пункте 2 настоящего приказа, по запросам руководителей следственных отделов, следователей, контрольно-следственного отдела, следственных отделов по расследованию особо важных дел либо по поручению руководителя следственного управления или курирующего заместителя руководителя следственного управления.</w:t>
       </w:r>
     </w:p>
     <w:p>
@@ -2367,7 +2383,7 @@
           <w:i w:val="0"/>
           <w:sz w:val="28"/>
         </w:rPr>
-        <w:t xml:space="preserve"> Изучать уголовные дела, по которым планируется возбуждение ходатайства о продлении процессуальных сроков ввиду длительного производства экспертных исследований, в части своевременности, полноты и качества назначения экспертиз, уровня взаимодействия с экспертными учреждениями, сроков и своевременности проведения экспертных исследований, в целях подготовки справки криминалистического характера.</w:t>
+        <w:t xml:space="preserve"> Изучать уголовные дела, по которым планируется возбуждение ходатайства о продлении процессуальных сроков ввиду длительного производства экспертных исследований, в части своевременности, полноты и качества назначения экспертиз, уровня взаимодействия с экспертными учреждениями, сроков и своевременности проведения экспертных исследований, в целях подготовки справки отдела криминалистики по вопросам назначения и производства судебных экспертиз.</w:t>
       </w:r>
     </w:p>
     <w:p>
@@ -2549,7 +2565,7 @@
           <w:i w:val="0"/>
           <w:sz w:val="28"/>
         </w:rPr>
-        <w:t xml:space="preserve"> По запросам контрольно-следственного отдела следственного управления, следственных отделов по расследованию особо важных дел следственного управления, руководителей следственных отделов, а также по поручению руководителя следственного управления или курирующего заместителя руководителя следственного управления представлять справки и заключения по вопросам криминалистического характера, копии подготовленных отделом криминалистики справок, заключений и предложений, а также иную информацию, необходимую для подготовки мотивированных ответов на жалобы и обращения граждан и принятия решений в пределах компетенции.</w:t>
+        <w:t xml:space="preserve"> По запросам контрольно-следственного отдела следственного управления, следственных отделов по расследованию особо важных дел следственного управления, руководителей следственных отделов, а также по поручению руководителя следственного управления или курирующего заместителя руководителя следственного управления представлять справки, заключения и предложения по вопросам, относящимся к компетенции отдела криминалистики, а также иную информацию, необходимую для подготовки мотивированных ответов на жалобы и обращения граждан и принятия решений в пределах компетенции.</w:t>
       </w:r>
     </w:p>
     <w:p>
@@ -2590,7 +2606,7 @@
           <w:i w:val="0"/>
           <w:sz w:val="28"/>
         </w:rPr>
-        <w:t>Исключить возложение на следователей-криминалистов рассмотрения ходатайств о продлении процессуальных сроков, согласования прекращения уголовных дел и приостановления предварительного следствия в качестве органа процессуального контроля, подготовки заключений о законности и обоснованности процессуальных решений, рассмотрения жалоб, обращений и заявлений граждан, за исключением представления справок и заключений криминалистического характера по запросам уполномоченных должностных лиц.</w:t>
+        <w:t>Исключить возложение на следователей-криминалистов рассмотрения ходатайств о продлении процессуальных сроков, согласования прекращения уголовных дел и приостановления предварительного следствия в качестве органа процессуального контроля, подготовки заключений о законности и обоснованности процессуальных решений, рассмотрения жалоб, обращений и заявлений граждан, за исключением представления справок, заключений и предложений по вопросам, относящимся к компетенции отдела криминалистики, по запросам уполномоченных должностных лиц.</w:t>
       </w:r>
     </w:p>
     <w:p>

</xml_diff>